<commit_message>
docs(defense): why React on the web, not Blade, Livewire or Inertia
Two Q&As in the Bisaya reviewer. The reason to give is the two clients
(the web portal and the foreman app share one token-based API), not that
React is faster or more modern, which a panel can easily dispute.
</commit_message>
<xml_diff>
--- a/docs/HRIS_Defense_Reviewer_Bisaya.docx
+++ b/docs/HRIS_Defense_Reviewer_Bisaya.docx
@@ -4365,6 +4365,249 @@
           <w:szCs w:val="22"/>
         </w:rPr>
         <w:t xml:space="preserve">Dugang pa: naa'y migrations ug Eloquent ORM nga nagpasayon sa pagbantay sa 13-table nga schema, ug ang server-side crypto verification (Layer 4) nahimutang na sa parehas nga codebase.</w:t>
+      </w:r>
+    </w:p>
+    <w:p>
+      <w:pPr>
+        <w:spacing w:after="80" w:before="200"/>
+      </w:pPr>
+      <w:r>
+        <w:rPr>
+          <w:rFonts w:ascii="Calibri" w:cs="Calibri" w:eastAsia="Calibri" w:hAnsi="Calibri"/>
+          <w:b/>
+          <w:bCs/>
+          <w:color w:val="1A1F24"/>
+          <w:sz w:val="22"/>
+          <w:szCs w:val="22"/>
+        </w:rPr>
+        <w:t xml:space="preserve">P: Ngano React ang gigamit sa web, dili Laravel Blade?</w:t>
+      </w:r>
+    </w:p>
+    <w:p>
+      <w:pPr>
+        <w:spacing w:after="100" w:line="276"/>
+      </w:pPr>
+      <w:r>
+        <w:rPr>
+          <w:rFonts w:ascii="Calibri" w:cs="Calibri" w:eastAsia="Calibri" w:hAnsi="Calibri"/>
+          <w:b/>
+          <w:bCs/>
+          <w:color w:val="1A1F24"/>
+          <w:sz w:val="22"/>
+          <w:szCs w:val="22"/>
+        </w:rPr>
+        <w:t xml:space="preserve">T: </w:t>
+      </w:r>
+      <w:r>
+        <w:rPr>
+          <w:rFonts w:ascii="Calibri" w:cs="Calibri" w:eastAsia="Calibri" w:hAnsi="Calibri"/>
+          <w:color w:val="1A1F24"/>
+          <w:sz w:val="22"/>
+          <w:szCs w:val="22"/>
+        </w:rPr>
+        <w:t xml:space="preserve">Kay duha ka klase sa kliyente ang serbisyohan sa system: ang web portal sa opisina ug ang mobile app sa foreman. Ang Blade kay HTML nga gihimo sa server para sa browser — dili siya magamit sa mobile app. Busa bisan unsa pa ang buhaton, kinahanglan gyud og API para sa cellphone. Kung Blade pa ang web, duha ka bahin ang himuon ibabaw sa parehas ra nga logic: ang API para sa cellphone, ug ang Blade pages para sa browser. Sa React, usa ra ka API ang gigamit sa duha.</w:t>
+      </w:r>
+    </w:p>
+    <w:p>
+      <w:pPr>
+        <w:spacing w:after="100" w:line="276"/>
+      </w:pPr>
+      <w:r>
+        <w:rPr>
+          <w:rFonts w:ascii="Calibri" w:cs="Calibri" w:eastAsia="Calibri" w:hAnsi="Calibri"/>
+          <w:b/>
+          <w:bCs/>
+          <w:color w:val="1A1F24"/>
+          <w:sz w:val="22"/>
+          <w:szCs w:val="22"/>
+        </w:rPr>
+        <w:t xml:space="preserve"/>
+      </w:r>
+      <w:r>
+        <w:rPr>
+          <w:rFonts w:ascii="Calibri" w:cs="Calibri" w:eastAsia="Calibri" w:hAnsi="Calibri"/>
+          <w:color w:val="1A1F24"/>
+          <w:sz w:val="22"/>
+          <w:szCs w:val="22"/>
+        </w:rPr>
+        <w:t xml:space="preserve">Sayon nga paagi sa pagsabot: ang backend API mao ang kusina, ug ang web portal ug ang mobile app kay duha ka waiter nga parehas og gikuhaan nga kusina. Kung Blade pa, magbuhat pa mo og lain nga kusina para lang sa waiter sa browser.</w:t>
+      </w:r>
+    </w:p>
+    <w:p>
+      <w:pPr>
+        <w:spacing w:after="100" w:line="276"/>
+      </w:pPr>
+      <w:r>
+        <w:rPr>
+          <w:rFonts w:ascii="Calibri" w:cs="Calibri" w:eastAsia="Calibri" w:hAnsi="Calibri"/>
+          <w:b/>
+          <w:bCs/>
+          <w:color w:val="1A1F24"/>
+          <w:sz w:val="22"/>
+          <w:szCs w:val="22"/>
+        </w:rPr>
+        <w:t xml:space="preserve"/>
+      </w:r>
+      <w:r>
+        <w:rPr>
+          <w:rFonts w:ascii="Calibri" w:cs="Calibri" w:eastAsia="Calibri" w:hAnsi="Calibri"/>
+          <w:color w:val="1A1F24"/>
+          <w:sz w:val="22"/>
+          <w:szCs w:val="22"/>
+        </w:rPr>
+        <w:t xml:space="preserve">Makita ni sa aktuwal nga code: ang backend/routes/api.php naay 61 ka route, samtang ang routes/web.php naay usa ra, ug ang bugtong Blade file kay ang welcome.blade.php nga default sa Laravel — wala gani nahilabti. Nagpasabot nga ang tanan nga datos moagi na sa API.</w:t>
+      </w:r>
+    </w:p>
+    <w:p>
+      <w:pPr>
+        <w:spacing w:after="100" w:line="276"/>
+      </w:pPr>
+      <w:r>
+        <w:rPr>
+          <w:rFonts w:ascii="Calibri" w:cs="Calibri" w:eastAsia="Calibri" w:hAnsi="Calibri"/>
+          <w:b/>
+          <w:bCs/>
+          <w:color w:val="1A1F24"/>
+          <w:sz w:val="22"/>
+          <w:szCs w:val="22"/>
+        </w:rPr>
+        <w:t xml:space="preserve"/>
+      </w:r>
+      <w:r>
+        <w:rPr>
+          <w:rFonts w:ascii="Calibri" w:cs="Calibri" w:eastAsia="Calibri" w:hAnsi="Calibri"/>
+          <w:color w:val="1A1F24"/>
+          <w:sz w:val="22"/>
+          <w:szCs w:val="22"/>
+        </w:rPr>
+        <w:t xml:space="preserve">Dugang pa, usa ra ka paagi sa pag-login ang gigamit sa duha: Sanctum bearer token. Kung Blade pa, session cookies para sa browser ug token para sa cellphone — duha ka auth system nga bantayan ug testingan.</w:t>
+      </w:r>
+    </w:p>
+    <w:p>
+      <w:pPr>
+        <w:spacing w:after="100" w:line="276"/>
+      </w:pPr>
+      <w:r>
+        <w:rPr>
+          <w:rFonts w:ascii="Calibri" w:cs="Calibri" w:eastAsia="Calibri" w:hAnsi="Calibri"/>
+          <w:b/>
+          <w:bCs/>
+          <w:color w:val="1A1F24"/>
+          <w:sz w:val="22"/>
+          <w:szCs w:val="22"/>
+        </w:rPr>
+        <w:t xml:space="preserve"/>
+      </w:r>
+      <w:r>
+        <w:rPr>
+          <w:rFonts w:ascii="Calibri" w:cs="Calibri" w:eastAsia="Calibri" w:hAnsi="Calibri"/>
+          <w:color w:val="1A1F24"/>
+          <w:sz w:val="22"/>
+          <w:szCs w:val="22"/>
+        </w:rPr>
+        <w:t xml:space="preserve">Ug kay React Native man ang mobile app, parehas ra og pinulongan ug pamaagi ang duha ka frontend. Ang nakat-onan o naayo sa usa ka bahin kasagaran magamit pod sa pikas.</w:t>
+      </w:r>
+    </w:p>
+    <w:p>
+      <w:pPr>
+        <w:spacing w:after="100" w:line="276"/>
+      </w:pPr>
+      <w:r>
+        <w:rPr>
+          <w:rFonts w:ascii="Calibri" w:cs="Calibri" w:eastAsia="Calibri" w:hAnsi="Calibri"/>
+          <w:b/>
+          <w:bCs/>
+          <w:color w:val="1A1F24"/>
+          <w:sz w:val="22"/>
+          <w:szCs w:val="22"/>
+        </w:rPr>
+        <w:t xml:space="preserve"/>
+      </w:r>
+      <w:r>
+        <w:rPr>
+          <w:rFonts w:ascii="Calibri" w:cs="Calibri" w:eastAsia="Calibri" w:hAnsi="Calibri"/>
+          <w:color w:val="1A1F24"/>
+          <w:sz w:val="22"/>
+          <w:szCs w:val="22"/>
+        </w:rPr>
+        <w:t xml:space="preserve">Katapusan, ang mga screen sama sa roll call, sync queue ug payroll run kanunay mag-usab og datos ug kinahanglan mo-update dayon nga walay reload sa tibuok page. Ang kusog sa Blade kay ang mga page nga gihimo sa server; kining maong mga screen mahimo gihapong Blade dugang og daghang JavaScript — mao nay makuha nimo ang kahuyang sa duha.</w:t>
+      </w:r>
+    </w:p>
+    <w:p>
+      <w:pPr>
+        <w:spacing w:after="100" w:line="276"/>
+      </w:pPr>
+      <w:r>
+        <w:rPr>
+          <w:rFonts w:ascii="Calibri" w:cs="Calibri" w:eastAsia="Calibri" w:hAnsi="Calibri"/>
+          <w:b/>
+          <w:bCs/>
+          <w:color w:val="1A1F24"/>
+          <w:sz w:val="22"/>
+          <w:szCs w:val="22"/>
+        </w:rPr>
+        <w:t xml:space="preserve"/>
+      </w:r>
+      <w:r>
+        <w:rPr>
+          <w:rFonts w:ascii="Calibri" w:cs="Calibri" w:eastAsia="Calibri" w:hAnsi="Calibri"/>
+          <w:b/>
+          <w:bCs/>
+          <w:color w:val="A32E24"/>
+          <w:sz w:val="22"/>
+          <w:szCs w:val="22"/>
+        </w:rPr>
+        <w:t xml:space="preserve">[TUL-ID] </w:t>
+      </w:r>
+      <w:r>
+        <w:rPr>
+          <w:rFonts w:ascii="Calibri" w:cs="Calibri" w:eastAsia="Calibri" w:hAnsi="Calibri"/>
+          <w:color w:val="1A1F24"/>
+          <w:sz w:val="22"/>
+          <w:szCs w:val="22"/>
+        </w:rPr>
+        <w:t xml:space="preserve">Ayaw pag-ingon nga "mas paspas" o "mas moderno" ang React kaysa Blade — sayon ra kaayo ni kontrahon sa panel. Ang tinuod nga hinungdan kay ang duha ka kliyente. Prangka sab sa disbentaha: mas daghan ang parte (lain nga build, CORS), gisublian ang uban nga validation sa client, ug 438 KB ang web bundle (126 KB kung compressed). Dawaton kini kay kinahanglan gyud ang API para sa cellphone bisan unsa pay mahitabo.</w:t>
+      </w:r>
+    </w:p>
+    <w:p>
+      <w:pPr>
+        <w:spacing w:after="80" w:before="200"/>
+      </w:pPr>
+      <w:r>
+        <w:rPr>
+          <w:rFonts w:ascii="Calibri" w:cs="Calibri" w:eastAsia="Calibri" w:hAnsi="Calibri"/>
+          <w:b/>
+          <w:bCs/>
+          <w:color w:val="1A1F24"/>
+          <w:sz w:val="22"/>
+          <w:szCs w:val="22"/>
+        </w:rPr>
+        <w:t xml:space="preserve">P: Ngano dili na lang Livewire o Inertia, aron magpabilin sa PHP?</w:t>
+      </w:r>
+    </w:p>
+    <w:p>
+      <w:pPr>
+        <w:spacing w:after="100" w:line="276"/>
+      </w:pPr>
+      <w:r>
+        <w:rPr>
+          <w:rFonts w:ascii="Calibri" w:cs="Calibri" w:eastAsia="Calibri" w:hAnsi="Calibri"/>
+          <w:b/>
+          <w:bCs/>
+          <w:color w:val="1A1F24"/>
+          <w:sz w:val="22"/>
+          <w:szCs w:val="22"/>
+        </w:rPr>
+        <w:t xml:space="preserve">T: </w:t>
+      </w:r>
+      <w:r>
+        <w:rPr>
+          <w:rFonts w:ascii="Calibri" w:cs="Calibri" w:eastAsia="Calibri" w:hAnsi="Calibri"/>
+          <w:color w:val="1A1F24"/>
+          <w:sz w:val="22"/>
+          <w:szCs w:val="22"/>
+        </w:rPr>
+        <w:t xml:space="preserve">Tinuod nga maayo sila nga tunga-tunga, ug kung web ra ang system, pwede gyud sila. Apan dili nila ma-render ang React Native app — para gihapon sa browser sila. Mag-API gihapon mo para sa cellphone, unya ang duha ninyo ka frontend magkalahi na og paagi imbes nga usa ra. Mao nga wala silay madugang nga kaayohan dinhi.</w:t>
       </w:r>
     </w:p>
     <w:p>

</xml_diff>